<commit_message>
Update CV with latest content
</commit_message>
<xml_diff>
--- a/src/content/James King CV.docx
+++ b/src/content/James King CV.docx
@@ -19,7 +19,7 @@
         <w:jc w:val="center"/>
       </w:pPr>
       <w:r>
-        <w:t>Technical Lead | AI Code Governance</w:t>
+        <w:t>Technical Lead | Compliance &amp; Engineering Governance</w:t>
       </w:r>
     </w:p>
     <w:p>
@@ -48,7 +48,7 @@
     </w:p>
     <w:p>
       <w:r>
-        <w:t>Leveraging AI daily to build production features safely. Proven experience delivering high-compliance systems processing millions in payments, extensive code review ownership, and mentoring junior developers who progressed to Senior roles. Writes AI skills and guidelines to improve development workflows. Passionate advocate of test automation and best practices in software development. I help teams safely integrate AI into development workflows through rigorous code review, compliance frameworks, and governance processes.</w:t>
+        <w:t>Technical Lead with 10+ years delivering high-compliance systems in regulated environments, including government services and payment infrastructure processing millions annually. Experienced in engineering governance, code review, and test-driven development across Symfony and Laravel codebases. Specialises in safely integrating AI into production workflows: writing governance frameworks, reviewing AI-generated code, and establishing team standards that balance velocity with compliance rigour.</w:t>
       </w:r>
     </w:p>
     <w:p>
@@ -125,19 +125,19 @@
         <w:rPr>
           <w:sz w:val="20"/>
         </w:rPr>
-        <w:t>• Developed features for Wider Plan salary sacrifice system and Gov.UK services</w:t>
+        <w:t>• Delivered features across a compliance-critical salary sacrifice platform and Gov.UK services, operating under strict HMRC regulatory and WCAG AA accessibility requirements</w:t>
         <w:br/>
-        <w:t>• Collaborated within an 8-developer team delivering government services under strict compliance and WCAG AA accessibility constraints</w:t>
+        <w:t>• Contributed to an 8-developer team building government-facing services, maintaining consistent delivery within tightly governed compliance and accessibility frameworks across a six-year tenure</w:t>
         <w:br/>
-        <w:t>• Converted CI/CD pipeline from legacy Jenkins to GitHub Actions with custom runner VMs</w:t>
+        <w:t>• Converted CI/CD pipeline from legacy Jenkins to GitHub Actions with custom runner VMs, improving deployment reliability and team efficiency</w:t>
         <w:br/>
-        <w:t>• Active code reviewer via GitHub PRs, ensuring high code quality and test coverage</w:t>
+        <w:t>• Regular code reviewer via GitHub PRs, upholding quality and compliance standards in a regulated production environment</w:t>
         <w:br/>
-        <w:t>• Maintained large Symfony codebase supporting payment systems processing millions</w:t>
+        <w:t>• Maintained and extended compliance-critical payment infrastructure processing millions in transactions annually, within a large-scale Symfony codebase</w:t>
         <w:br/>
-        <w:t>• Devised automated tests in PHPUnit: Acceptance, Feature and Unit testing</w:t>
+        <w:t>• Designed and implemented a full automated test suite in PHPUnit covering acceptance, feature, and unit layers, establishing testing standards adopted across the team</w:t>
         <w:br/>
-        <w:t>• Established tooling for deployment and PR staging environments, saving team time</w:t>
+        <w:t>• Established tooling for deployment and PR staging environments, reducing manual overhead and improving team workflow</w:t>
       </w:r>
     </w:p>
     <w:p>
@@ -368,7 +368,7 @@
     </w:p>
     <w:p>
       <w:r>
-        <w:t>Full Stack Web Development | Laravel | PHP | Symfony | JavaScript | Node.js | React | AlpineJS | AJAX | CSS | TailwindCSS | Docker | Kubernetes | JSON REST APIs | GraphQL | MySQL | MariaDB | PostgreSQL | AWS | DigitalOcean | Hetzner | Cloudflare R2 | Redis | KeyDB | Valkey | Terraform | Ansible | IaaS | Linux | Server Administration | Git | GitHub | GitHub Actions | WordPress | WooCommerce | Test-driven Development | Pest | PHPUnit</w:t>
+        <w:t>Full Stack Web Development | Laravel | PHP | Symfony | JavaScript | Node.js | React | AlpineJS | AJAX | CSS | TailwindCSS | Docker | Kubernetes | JSON REST APIs | GraphQL | MySQL | MariaDB | PostgreSQL | AWS | DigitalOcean | Hetzner | Cloudflare R2 | Redis | KeyDB | Valkey | Terraform | Ansible | IaaS | Linux | Server Administration | Git | GitHub | GitHub Actions | Test-driven Development | Pest | PHPUnit | GDPR | OWASP | WCAG AA | Security Auditing | ISO 27001</w:t>
       </w:r>
     </w:p>
     <w:p>

</xml_diff>

<commit_message>
Update CV for job change: Varsuite -> Artifax Software Limited
- End Varsuite CTO role (Nov 2024 - Jun 2026) on CV and about page
- Add Senior Software Engineer at Artifax Software Limited (Jul 2026 - Present)
- End Varsuite Core side project (Dec 2024 - Jun 2026)
- Remove Varsuite Core from projects, add Laravel Moat AUR
- Update homepage, about page, now page, and humans.txt for new role
- Add content collection schema config
</commit_message>
<xml_diff>
--- a/src/content/James King CV.docx
+++ b/src/content/James King CV.docx
@@ -64,6 +64,29 @@
       </w:r>
     </w:p>
     <w:p>
+      <w:pPr>
+        <w:spacing w:before="0"/>
+      </w:pPr>
+      <w:r>
+        <w:rPr>
+          <w:b/>
+          <w:sz w:val="22"/>
+        </w:rPr>
+        <w:t>Senior Software Engineer</w:t>
+      </w:r>
+      <w:r>
+        <w:rPr>
+          <w:sz w:val="20"/>
+        </w:rPr>
+        <w:t xml:space="preserve"> | Artifax Software Limited | July 2026 - Present</w:t>
+      </w:r>
+    </w:p>
+    <w:p>
+      <w:r>
+        <w:t>Venue and event management software for arts, culture, and entertainment. www.artifax.com</w:t>
+      </w:r>
+    </w:p>
+    <w:p>
       <w:r>
         <w:rPr>
           <w:b/>
@@ -75,7 +98,7 @@
         <w:rPr>
           <w:sz w:val="20"/>
         </w:rPr>
-        <w:t xml:space="preserve"> | Varsuite Media Group Ltd | November 2024 - Present</w:t>
+        <w:t xml:space="preserve"> | Varsuite Media Group Ltd | November 2024 - June 2026</w:t>
       </w:r>
     </w:p>
     <w:p>
@@ -271,7 +294,7 @@
         <w:rPr>
           <w:sz w:val="20"/>
         </w:rPr>
-        <w:t xml:space="preserve"> | Varsuite Core Ltd | December 2024 - Present</w:t>
+        <w:t xml:space="preserve"> | Varsuite Core Ltd | December 2024 - June 2026</w:t>
       </w:r>
     </w:p>
     <w:p>

</xml_diff>